<commit_message>
CM approve EXOS-FIN-004-0 International Contractor Payments (D-7282118)
Procedure approved by John Quinn, Cofounder & CEO via D-7282118.
- Status Draft → Approved; remarks updated
- Rebuilt docx v2, updated Procedures Master List
- Re-registered in cm-register.json (indent-2 canonical form)
</commit_message>
<xml_diff>
--- a/process-library/12-finance-accounting/EXOS-FIN-004-0_International_Contractor_Payments_&_Contractor_Expense_Reimbursement_(incl._JPY).docx
+++ b/process-library/12-finance-accounting/EXOS-FIN-004-0_International_Contractor_Payments_&_Contractor_Expense_Reimbursement_(incl._JPY).docx
@@ -51,7 +51,7 @@
           <w:color w:val="1C1C1C"/>
           <w:sz w:val="18"/>
         </w:rPr>
-        <w:t>10/15/2026</w:t>
+        <w:t>10/16/2026</w:t>
       </w:r>
     </w:p>
     <w:p>
@@ -77,7 +77,7 @@
           <w:color w:val="1C1C1C"/>
           <w:sz w:val="18"/>
         </w:rPr>
-        <w:t>DRAFT</w:t>
+        <w:t>APPROVED</w:t>
       </w:r>
     </w:p>
     <w:p>

</xml_diff>